<commit_message>
Convert plain-text raw URLs to smart, contextual hyperlinks across all docx files
</commit_message>
<xml_diff>
--- a/Revised_KB_Documents/Cash Register Kiosk Win11 - 2025 Setup Process.docx
+++ b/Revised_KB_Documents/Cash Register Kiosk Win11 - 2025 Setup Process.docx
@@ -574,67 +574,34 @@
       <w:r>
         <w:rPr>
           <w:rFonts w:ascii="Calibri" w:hAnsi="Calibri"/>
-          <w:b w:val="0"/>
-          <w:i w:val="0"/>
           <w:sz w:val="22"/>
         </w:rPr>
-        <w:t>When prompted, choose the start page:</w:t>
-        <w:br/>
-        <w:tab/>
+        <w:t xml:space="preserve">When prompted, choose the </w:t>
       </w:r>
+      <w:hyperlink r:id="rId12">
+        <w:r>
+          <w:rPr>
+            <w:color w:val="0000FF"/>
+            <w:u w:val="single"/>
+          </w:rPr>
+          <w:t>start page: SMSU</w:t>
+        </w:r>
+      </w:hyperlink>
+      <w:hyperlink r:id="rId13">
+        <w:r>
+          <w:rPr>
+            <w:color w:val="0000FF"/>
+            <w:u w:val="single"/>
+          </w:rPr>
+          <w:t>) StarID</w:t>
+        </w:r>
+      </w:hyperlink>
       <w:r>
         <w:rPr>
           <w:rFonts w:ascii="Calibri" w:hAnsi="Calibri"/>
-          <w:b w:val="0"/>
-          <w:i w:val="0"/>
           <w:sz w:val="22"/>
         </w:rPr>
-        <w:t>SMSU (https://www.smsu.edu)</w:t>
-        <w:br/>
-      </w:r>
-      <w:r>
-        <w:rPr>
-          <w:rFonts w:ascii="Calibri" w:hAnsi="Calibri"/>
-          <w:b/>
-          <w:i w:val="0"/>
-          <w:sz w:val="22"/>
-        </w:rPr>
-        <w:t>StarID</w:t>
-      </w:r>
-      <w:r>
-        <w:rPr>
-          <w:rFonts w:ascii="Calibri" w:hAnsi="Calibri"/>
-          <w:b w:val="0"/>
-          <w:i w:val="0"/>
-          <w:sz w:val="22"/>
-        </w:rPr>
-        <w:t xml:space="preserve"> (https://</w:t>
-      </w:r>
-      <w:r>
-        <w:rPr>
-          <w:rFonts w:ascii="Calibri" w:hAnsi="Calibri"/>
-          <w:b/>
-          <w:i w:val="0"/>
-          <w:sz w:val="22"/>
-        </w:rPr>
-        <w:t>starid</w:t>
-      </w:r>
-      <w:r>
-        <w:rPr>
-          <w:rFonts w:ascii="Calibri" w:hAnsi="Calibri"/>
-          <w:b w:val="0"/>
-          <w:i w:val="0"/>
-          <w:sz w:val="22"/>
-        </w:rPr>
-        <w:t xml:space="preserve">.minnstate.edu) </w:t>
-      </w:r>
-      <w:r>
-        <w:rPr>
-          <w:rFonts w:ascii="Calibri" w:hAnsi="Calibri"/>
-          <w:b w:val="0"/>
-          <w:i w:val="0"/>
-          <w:sz w:val="22"/>
-        </w:rPr>
+        <w:t xml:space="preserve">) </w:t>
         <w:br/>
         <w:tab/>
       </w:r>
@@ -644,29 +611,18 @@
         <w:pStyle w:val="ListBullet"/>
         <w:spacing w:line="276" w:lineRule="auto" w:after="80"/>
       </w:pPr>
-      <w:r>
-        <w:rPr>
-          <w:rFonts w:ascii="Calibri" w:hAnsi="Calibri"/>
-          <w:b w:val="0"/>
-          <w:i w:val="0"/>
-          <w:sz w:val="22"/>
-        </w:rPr>
-        <w:t>SMSU (</w:t>
-      </w:r>
-      <w:hyperlink r:id="rId10">
+      <w:hyperlink r:id="rId12">
         <w:r>
           <w:rPr>
             <w:color w:val="0000FF"/>
             <w:u w:val="single"/>
           </w:rPr>
-          <w:t>https://www.smsu.edu</w:t>
+          <w:t>SMSU</w:t>
         </w:r>
       </w:hyperlink>
       <w:r>
         <w:rPr>
           <w:rFonts w:ascii="Calibri" w:hAnsi="Calibri"/>
-          <w:b w:val="0"/>
-          <w:i w:val="0"/>
           <w:sz w:val="22"/>
         </w:rPr>
         <w:t>)</w:t>
@@ -677,38 +633,18 @@
         <w:pStyle w:val="ListBullet"/>
         <w:spacing w:line="276" w:lineRule="auto" w:after="80"/>
       </w:pPr>
-      <w:r>
-        <w:rPr>
-          <w:rFonts w:ascii="Calibri" w:hAnsi="Calibri"/>
-          <w:b/>
-          <w:i w:val="0"/>
-          <w:sz w:val="22"/>
-        </w:rPr>
-        <w:t>StarID</w:t>
-      </w:r>
-      <w:r>
-        <w:rPr>
-          <w:rFonts w:ascii="Calibri" w:hAnsi="Calibri"/>
-          <w:b w:val="0"/>
-          <w:i w:val="0"/>
-          <w:sz w:val="22"/>
-        </w:rPr>
-        <w:t xml:space="preserve"> (</w:t>
-      </w:r>
-      <w:hyperlink r:id="rId11">
+      <w:hyperlink r:id="rId13">
         <w:r>
           <w:rPr>
             <w:color w:val="0000FF"/>
             <w:u w:val="single"/>
           </w:rPr>
-          <w:t>https://starid.minnstate.edu</w:t>
+          <w:t>StarID</w:t>
         </w:r>
       </w:hyperlink>
       <w:r>
         <w:rPr>
           <w:rFonts w:ascii="Calibri" w:hAnsi="Calibri"/>
-          <w:b w:val="0"/>
-          <w:i w:val="0"/>
           <w:sz w:val="22"/>
         </w:rPr>
         <w:t xml:space="preserve">) </w:t>

</xml_diff>